<commit_message>
Add diagnosed dataset stage and prepare cleaning pipeline structure
</commit_message>
<xml_diff>
--- a/reports/Weekly Report- Week [1].docx
+++ b/reports/Weekly Report- Week [1].docx
@@ -3,57 +3,63 @@
 <w:document xmlns:wpc="http://schemas.microsoft.com/office/word/2010/wordprocessingCanvas" xmlns:cx="http://schemas.microsoft.com/office/drawing/2014/chartex" xmlns:cx1="http://schemas.microsoft.com/office/drawing/2015/9/8/chartex" xmlns:cx2="http://schemas.microsoft.com/office/drawing/2015/10/21/chartex" xmlns:cx3="http://schemas.microsoft.com/office/drawing/2016/5/9/chartex" xmlns:cx4="http://schemas.microsoft.com/office/drawing/2016/5/10/chartex" xmlns:cx5="http://schemas.microsoft.com/office/drawing/2016/5/11/chartex" xmlns:cx6="http://schemas.microsoft.com/office/drawing/2016/5/12/chartex" xmlns:cx7="http://schemas.microsoft.com/office/drawing/2016/5/13/chartex" xmlns:cx8="http://schemas.microsoft.com/office/drawing/2016/5/14/chartex" xmlns:mc="http://schemas.openxmlformats.org/markup-compatibility/2006" xmlns:aink="http://schemas.microsoft.com/office/drawing/2016/ink" xmlns:am3d="http://schemas.microsoft.com/office/drawing/2017/model3d" xmlns:o="urn:schemas-microsoft-com:office:office" xmlns:oel="http://schemas.microsoft.com/office/2019/extlst" xmlns:r="http://schemas.openxmlformats.org/officeDocument/2006/relationships" xmlns:m="http://schemas.openxmlformats.org/officeDocument/2006/math" xmlns:v="urn:schemas-microsoft-com:vml" xmlns:wp14="http://schemas.microsoft.com/office/word/2010/wordprocessingDrawing" xmlns:wp="http://schemas.openxmlformats.org/drawingml/2006/wordprocessingDrawing" xmlns:w10="urn:schemas-microsoft-com:office:word" xmlns:w="http://schemas.openxmlformats.org/wordprocessingml/2006/main" xmlns:w14="http://schemas.microsoft.com/office/word/2010/wordml" xmlns:w15="http://schemas.microsoft.com/office/word/2012/wordml" xmlns:w16cex="http://schemas.microsoft.com/office/word/2018/wordml/cex" xmlns:w16cid="http://schemas.microsoft.com/office/word/2016/wordml/cid" xmlns:w16="http://schemas.microsoft.com/office/word/2018/wordml" xmlns:w16du="http://schemas.microsoft.com/office/word/2023/wordml/word16du" xmlns:w16sdtdh="http://schemas.microsoft.com/office/word/2020/wordml/sdtdatahash" xmlns:w16sdtfl="http://schemas.microsoft.com/office/word/2024/wordml/sdtformatlock" xmlns:w16se="http://schemas.microsoft.com/office/word/2015/wordml/symex" xmlns:wpg="http://schemas.microsoft.com/office/word/2010/wordprocessingGroup" xmlns:wpi="http://schemas.microsoft.com/office/word/2010/wordprocessingInk" xmlns:wne="http://schemas.microsoft.com/office/word/2006/wordml" xmlns:wps="http://schemas.microsoft.com/office/word/2010/wordprocessingShape" mc:Ignorable="w14 w15 w16se w16cid w16 w16cex w16sdtdh w16sdtfl w16du wp14">
   <w:body>
     <w:p>
+      <w:pPr>
+        <w:pStyle w:val="ListParagraph"/>
+        <w:ind w:left="142" w:right="-592"/>
+      </w:pPr>
       <w:r>
         <w:t>Weekly Report — Week 1</w:t>
       </w:r>
     </w:p>
-    <w:p/>
-    <w:p>
-      <w:pPr>
-        <w:spacing w:after="0"/>
-      </w:pPr>
-      <w:r>
-        <w:t>Name:</w:t>
-      </w:r>
-      <w:r>
-        <w:tab/>
-      </w:r>
-      <w:r>
-        <w:tab/>
-      </w:r>
-      <w:r>
-        <w:t xml:space="preserve"> Tynisha Niles</w:t>
-      </w:r>
-    </w:p>
-    <w:p>
-      <w:pPr>
-        <w:spacing w:after="0"/>
-      </w:pPr>
-      <w:r>
-        <w:t>Date:</w:t>
-      </w:r>
-      <w:r>
-        <w:tab/>
-      </w:r>
-      <w:r>
-        <w:tab/>
-      </w:r>
-      <w:r>
-        <w:t xml:space="preserve"> 24/04/2026</w:t>
-      </w:r>
-    </w:p>
-    <w:p>
-      <w:pPr>
-        <w:spacing w:after="0"/>
+    <w:p>
+      <w:pPr>
+        <w:pStyle w:val="ListParagraph"/>
+        <w:ind w:left="142" w:right="-592"/>
+      </w:pPr>
+    </w:p>
+    <w:p>
+      <w:pPr>
+        <w:pStyle w:val="ListParagraph"/>
+        <w:ind w:left="142" w:right="-592"/>
+      </w:pPr>
+      <w:r>
+        <w:t>Name: Tynisha Niles</w:t>
+      </w:r>
+    </w:p>
+    <w:p>
+      <w:pPr>
+        <w:pStyle w:val="ListParagraph"/>
+        <w:ind w:left="142" w:right="-592"/>
+      </w:pPr>
+      <w:r>
+        <w:t>Date: 24/04/2026</w:t>
+      </w:r>
+    </w:p>
+    <w:p>
+      <w:pPr>
+        <w:pStyle w:val="ListParagraph"/>
+        <w:ind w:left="142" w:right="-592"/>
       </w:pPr>
       <w:r>
         <w:t>Hours on assignment this week: 12hrs</w:t>
       </w:r>
     </w:p>
-    <w:p/>
-    <w:p>
+    <w:p>
+      <w:pPr>
+        <w:pStyle w:val="ListParagraph"/>
+        <w:ind w:right="-592"/>
+      </w:pPr>
+    </w:p>
+    <w:p>
+      <w:pPr>
+        <w:pStyle w:val="ListParagraph"/>
+        <w:ind w:left="142" w:right="-592"/>
+      </w:pPr>
       <w:r>
         <w:t>1. What I completed this week</w:t>
+      </w:r>
+      <w:r>
+        <w:t>?</w:t>
       </w:r>
     </w:p>
     <w:p>
@@ -63,6 +69,7 @@
           <w:ilvl w:val="0"/>
           <w:numId w:val="2"/>
         </w:numPr>
+        <w:ind w:right="-592"/>
       </w:pPr>
       <w:r>
         <w:t>Created GitHub repository and project structure with folders: config/, scripts/, data/, outputs/, and reports/.</w:t>
@@ -75,6 +82,7 @@
           <w:ilvl w:val="0"/>
           <w:numId w:val="2"/>
         </w:numPr>
+        <w:ind w:right="-592"/>
       </w:pPr>
       <w:r>
         <w:t>Implemented configuration file (config.R) for centralized path and parameter management.</w:t>
@@ -87,6 +95,7 @@
           <w:ilvl w:val="0"/>
           <w:numId w:val="2"/>
         </w:numPr>
+        <w:ind w:right="-592"/>
       </w:pPr>
       <w:r>
         <w:t>Developed ingestion script (01_ingest.R) to read raw healthcare dataset (CSV format).</w:t>
@@ -99,6 +108,7 @@
           <w:ilvl w:val="0"/>
           <w:numId w:val="2"/>
         </w:numPr>
+        <w:ind w:right="-592"/>
       </w:pPr>
       <w:r>
         <w:t>Modified ingestion to correctly interpret text values such as "NaN" as missing values.</w:t>
@@ -111,6 +121,7 @@
           <w:ilvl w:val="0"/>
           <w:numId w:val="2"/>
         </w:numPr>
+        <w:ind w:right="-592"/>
       </w:pPr>
       <w:r>
         <w:t>Implemented diagnostic script (02_diagnose.R) to generate missingness summaries and categorical diagnostics.</w:t>
@@ -123,15 +134,10 @@
           <w:ilvl w:val="0"/>
           <w:numId w:val="2"/>
         </w:numPr>
-      </w:pPr>
-      <w:r>
-        <w:t xml:space="preserve">Generated missingness summary identifying missing values in </w:t>
-      </w:r>
-      <w:r>
-        <w:t>Age, Blood.Pressure</w:t>
-      </w:r>
-      <w:r>
-        <w:t>, Cholesterol, Email and Phone.Number variables.</w:t>
+        <w:ind w:right="-592"/>
+      </w:pPr>
+      <w:r>
+        <w:t>Generated missingness summary identifying missing values in Blood.Pressure and Cholesterol variables due to text-based "NaN" entries.</w:t>
       </w:r>
     </w:p>
     <w:p>
@@ -141,6 +147,7 @@
           <w:ilvl w:val="0"/>
           <w:numId w:val="2"/>
         </w:numPr>
+        <w:ind w:right="-592"/>
       </w:pPr>
       <w:r>
         <w:t>Identified presence of leading/trailing whitespace in patient names.</w:t>
@@ -153,6 +160,7 @@
           <w:ilvl w:val="0"/>
           <w:numId w:val="2"/>
         </w:numPr>
+        <w:ind w:right="-592"/>
       </w:pPr>
       <w:r>
         <w:t>Produced unique patient name list confirming 10 repeated patient names across dataset.</w:t>
@@ -165,9 +173,10 @@
           <w:ilvl w:val="0"/>
           <w:numId w:val="2"/>
         </w:numPr>
-      </w:pPr>
-      <w:r>
-        <w:t>Drafted initial problem inventory identifying major data quality issues.</w:t>
+        <w:ind w:right="-592"/>
+      </w:pPr>
+      <w:r>
+        <w:t>Drafted initial problem inventory identifying major data quality issues affecting patient identifiers, diagnosis values, and categorical formatting.</w:t>
       </w:r>
     </w:p>
     <w:p>
@@ -177,15 +186,28 @@
           <w:ilvl w:val="0"/>
           <w:numId w:val="2"/>
         </w:numPr>
+        <w:ind w:right="-592"/>
       </w:pPr>
       <w:r>
         <w:t>Verified full pipeline execution through run_pipeline.R entry-point script.</w:t>
       </w:r>
     </w:p>
-    <w:p/>
-    <w:p>
+    <w:p>
+      <w:pPr>
+        <w:pStyle w:val="ListParagraph"/>
+        <w:ind w:right="-592"/>
+      </w:pPr>
+    </w:p>
+    <w:p>
+      <w:pPr>
+        <w:pStyle w:val="ListParagraph"/>
+        <w:ind w:left="142" w:right="-592"/>
+      </w:pPr>
       <w:r>
         <w:t>2. What I plan for next week</w:t>
+      </w:r>
+      <w:r>
+        <w:t>?</w:t>
       </w:r>
     </w:p>
     <w:p>
@@ -195,9 +217,10 @@
           <w:ilvl w:val="0"/>
           <w:numId w:val="2"/>
         </w:numPr>
-      </w:pPr>
-      <w:r>
-        <w:t>Implement name cleaning script to remove whitespace and standardize casing.</w:t>
+        <w:ind w:right="-592"/>
+      </w:pPr>
+      <w:r>
+        <w:t>Implement patient identifier cleaning to standardize Patient.Name values by trimming whitespace and normalizing case formatting.</w:t>
       </w:r>
     </w:p>
     <w:p>
@@ -207,9 +230,10 @@
           <w:ilvl w:val="0"/>
           <w:numId w:val="2"/>
         </w:numPr>
-      </w:pPr>
-      <w:r>
-        <w:t>Begin date parsing and validation for Visit.Date variable.</w:t>
+        <w:ind w:right="-592"/>
+      </w:pPr>
+      <w:r>
+        <w:t>Perform admission/discharge (Visit.Date) parsing to convert Visit.Date into standardized Date format and validate date consistency.</w:t>
       </w:r>
     </w:p>
     <w:p>
@@ -219,9 +243,10 @@
           <w:ilvl w:val="0"/>
           <w:numId w:val="2"/>
         </w:numPr>
-      </w:pPr>
-      <w:r>
-        <w:t>Implement category normalization for Gender variable.</w:t>
+        <w:ind w:right="-592"/>
+      </w:pPr>
+      <w:r>
+        <w:t>Begin free-text diagnosis normalization for Condition variable by standardizing capitalization and mapping equivalent condition labels.</w:t>
       </w:r>
     </w:p>
     <w:p>
@@ -231,9 +256,10 @@
           <w:ilvl w:val="0"/>
           <w:numId w:val="2"/>
         </w:numPr>
-      </w:pPr>
-      <w:r>
-        <w:t>Begin drafting structured data dictionary framework.</w:t>
+        <w:ind w:right="-592"/>
+      </w:pPr>
+      <w:r>
+        <w:t>Implement duplicate detection logic to identify potential duplicate patient records using near-duplicate name matching.</w:t>
       </w:r>
     </w:p>
     <w:p>
@@ -243,15 +269,10 @@
           <w:ilvl w:val="0"/>
           <w:numId w:val="2"/>
         </w:numPr>
-      </w:pPr>
-      <w:r>
-        <w:t>Extend diagnostic logging for transformation tracking.</w:t>
-      </w:r>
-    </w:p>
-    <w:p/>
-    <w:p>
-      <w:r>
-        <w:t>3. Blockers and issues</w:t>
+        <w:ind w:right="-592"/>
+      </w:pPr>
+      <w:r>
+        <w:t>Apply categorical case normalization to Gender and Medication variables to ensure consistent category formatting.</w:t>
       </w:r>
     </w:p>
     <w:p>
@@ -261,9 +282,25 @@
           <w:ilvl w:val="0"/>
           <w:numId w:val="2"/>
         </w:numPr>
-      </w:pPr>
-      <w:r>
-        <w:t>Initial difficulty configuring file paths and ensuring dataset loaded correctly.</w:t>
+        <w:ind w:right="-592"/>
+      </w:pPr>
+      <w:r>
+        <w:t>Begin constructing the structured data dictionary documenting variable definitions and cleaning actions.</w:t>
+      </w:r>
+    </w:p>
+    <w:p>
+      <w:pPr>
+        <w:pStyle w:val="ListParagraph"/>
+        <w:ind w:right="-592"/>
+      </w:pPr>
+    </w:p>
+    <w:p>
+      <w:pPr>
+        <w:pStyle w:val="ListParagraph"/>
+        <w:ind w:left="142" w:right="-592"/>
+      </w:pPr>
+      <w:r>
+        <w:t>3. Blockers and issues</w:t>
       </w:r>
     </w:p>
     <w:p>
@@ -273,9 +310,10 @@
           <w:ilvl w:val="0"/>
           <w:numId w:val="2"/>
         </w:numPr>
-      </w:pPr>
-      <w:r>
-        <w:t>Encountered issue where "NaN" values were stored as text instead of true missing values.</w:t>
+        <w:ind w:right="-592"/>
+      </w:pPr>
+      <w:r>
+        <w:t>Initial difficulty configuring file paths and ensuring dataset loaded correctly.</w:t>
       </w:r>
     </w:p>
     <w:p>
@@ -285,9 +323,10 @@
           <w:ilvl w:val="0"/>
           <w:numId w:val="2"/>
         </w:numPr>
-      </w:pPr>
-      <w:r>
-        <w:t>Some uncertainty remains regarding best structure for modular cleaning scripts.</w:t>
+        <w:ind w:right="-592"/>
+      </w:pPr>
+      <w:r>
+        <w:t>Encountered issue where "NaN" values were stored as text instead of true missing values.</w:t>
       </w:r>
     </w:p>
     <w:p>
@@ -297,15 +336,10 @@
           <w:ilvl w:val="0"/>
           <w:numId w:val="2"/>
         </w:numPr>
-      </w:pPr>
-      <w:r>
-        <w:t>No critical blockers at this time.</w:t>
-      </w:r>
-    </w:p>
-    <w:p/>
-    <w:p>
-      <w:r>
-        <w:t>4. Anything I need from the evaluating office</w:t>
+        <w:ind w:right="-592"/>
+      </w:pPr>
+      <w:r>
+        <w:t>Some uncertainty remains regarding best structure for modular cleaning scripts.</w:t>
       </w:r>
     </w:p>
     <w:p>
@@ -315,9 +349,25 @@
           <w:ilvl w:val="0"/>
           <w:numId w:val="2"/>
         </w:numPr>
-      </w:pPr>
-      <w:r>
-        <w:t>Clarification on preferred naming conventions for cleaning script modules.</w:t>
+        <w:ind w:right="-592"/>
+      </w:pPr>
+      <w:r>
+        <w:t>No critical blockers at this time.</w:t>
+      </w:r>
+    </w:p>
+    <w:p>
+      <w:pPr>
+        <w:pStyle w:val="ListParagraph"/>
+        <w:ind w:right="-592"/>
+      </w:pPr>
+    </w:p>
+    <w:p>
+      <w:pPr>
+        <w:pStyle w:val="ListParagraph"/>
+        <w:ind w:left="284" w:right="-592"/>
+      </w:pPr>
+      <w:r>
+        <w:t>4. Anything I need from the evaluating office</w:t>
       </w:r>
     </w:p>
     <w:p>
@@ -331,445 +381,10 @@
       <w:r>
         <w:t>Confirmation on acceptable thresholds for duplicate detection using string distance.</w:t>
       </w:r>
-      <w:r>
-        <w:br/>
-      </w:r>
-    </w:p>
-    <w:p>
-      <w:pPr>
-        <w:pStyle w:val="ListParagraph"/>
-        <w:ind w:left="142"/>
-      </w:pPr>
-      <w:r>
-        <w:lastRenderedPageBreak/>
-        <w:t>Weekly Report — Week 1</w:t>
-      </w:r>
-    </w:p>
-    <w:p>
-      <w:pPr>
-        <w:pStyle w:val="ListParagraph"/>
-        <w:ind w:left="142"/>
-      </w:pPr>
-    </w:p>
-    <w:p>
-      <w:pPr>
-        <w:pStyle w:val="ListParagraph"/>
-        <w:ind w:left="142"/>
-      </w:pPr>
-      <w:r>
-        <w:t>Name: Tynisha Niles</w:t>
-      </w:r>
-    </w:p>
-    <w:p>
-      <w:pPr>
-        <w:pStyle w:val="ListParagraph"/>
-        <w:ind w:left="142"/>
-      </w:pPr>
-      <w:r>
-        <w:t>Date: 24/04/2026</w:t>
-      </w:r>
-    </w:p>
-    <w:p>
-      <w:pPr>
-        <w:pStyle w:val="ListParagraph"/>
-        <w:ind w:left="142"/>
-      </w:pPr>
-      <w:r>
-        <w:t>Hours on assignment this week: 12hrs</w:t>
-      </w:r>
-    </w:p>
-    <w:p>
-      <w:pPr>
-        <w:pStyle w:val="ListParagraph"/>
-      </w:pPr>
-    </w:p>
-    <w:p>
-      <w:pPr>
-        <w:pStyle w:val="ListParagraph"/>
-        <w:ind w:left="142"/>
-      </w:pPr>
-      <w:r>
-        <w:t>1. What I completed this week</w:t>
-      </w:r>
-    </w:p>
-    <w:p>
-      <w:pPr>
-        <w:pStyle w:val="ListParagraph"/>
-      </w:pPr>
-    </w:p>
-    <w:p>
-      <w:pPr>
-        <w:pStyle w:val="ListParagraph"/>
-        <w:numPr>
-          <w:ilvl w:val="0"/>
-          <w:numId w:val="2"/>
-        </w:numPr>
-      </w:pPr>
-      <w:r>
-        <w:t>Created GitHub repository and project structure with folders: config/, scripts/, data/, outputs/, and reports/.</w:t>
-      </w:r>
-    </w:p>
-    <w:p>
-      <w:pPr>
-        <w:pStyle w:val="ListParagraph"/>
-        <w:numPr>
-          <w:ilvl w:val="0"/>
-          <w:numId w:val="2"/>
-        </w:numPr>
-      </w:pPr>
-      <w:r>
-        <w:t>Implemented configuration file (</w:t>
-      </w:r>
-      <w:proofErr w:type="gramStart"/>
-      <w:r>
-        <w:t>config.R</w:t>
-      </w:r>
-      <w:proofErr w:type="gramEnd"/>
-      <w:r>
-        <w:t>) for centralized path and parameter management.</w:t>
-      </w:r>
-    </w:p>
-    <w:p>
-      <w:pPr>
-        <w:pStyle w:val="ListParagraph"/>
-        <w:numPr>
-          <w:ilvl w:val="0"/>
-          <w:numId w:val="2"/>
-        </w:numPr>
-      </w:pPr>
-      <w:r>
-        <w:t>Developed ingestion script (01_</w:t>
-      </w:r>
-      <w:proofErr w:type="gramStart"/>
-      <w:r>
-        <w:t>ingest.R</w:t>
-      </w:r>
-      <w:proofErr w:type="gramEnd"/>
-      <w:r>
-        <w:t>) to read raw healthcare dataset (CSV format).</w:t>
-      </w:r>
-    </w:p>
-    <w:p>
-      <w:pPr>
-        <w:pStyle w:val="ListParagraph"/>
-        <w:numPr>
-          <w:ilvl w:val="0"/>
-          <w:numId w:val="2"/>
-        </w:numPr>
-      </w:pPr>
-      <w:r>
-        <w:t>Modified ingestion to correctly interpret text values such as "NaN" as missing values.</w:t>
-      </w:r>
-    </w:p>
-    <w:p>
-      <w:pPr>
-        <w:pStyle w:val="ListParagraph"/>
-        <w:numPr>
-          <w:ilvl w:val="0"/>
-          <w:numId w:val="2"/>
-        </w:numPr>
-      </w:pPr>
-      <w:r>
-        <w:t>Implemented diagnostic script (02_</w:t>
-      </w:r>
-      <w:proofErr w:type="gramStart"/>
-      <w:r>
-        <w:t>diagnose.R</w:t>
-      </w:r>
-      <w:proofErr w:type="gramEnd"/>
-      <w:r>
-        <w:t>) to generate missingness summaries and categorical diagnostics.</w:t>
-      </w:r>
-    </w:p>
-    <w:p>
-      <w:pPr>
-        <w:pStyle w:val="ListParagraph"/>
-        <w:numPr>
-          <w:ilvl w:val="0"/>
-          <w:numId w:val="2"/>
-        </w:numPr>
-      </w:pPr>
-      <w:r>
-        <w:t>Generated missingness summary identifying missing values in Blood.Pressure and Cholesterol variables due to text-based "NaN" entries.</w:t>
-      </w:r>
-    </w:p>
-    <w:p>
-      <w:pPr>
-        <w:pStyle w:val="ListParagraph"/>
-        <w:numPr>
-          <w:ilvl w:val="0"/>
-          <w:numId w:val="2"/>
-        </w:numPr>
-      </w:pPr>
-      <w:r>
-        <w:t>Identified presence of leading/trailing whitespace in patient names.</w:t>
-      </w:r>
-    </w:p>
-    <w:p>
-      <w:pPr>
-        <w:pStyle w:val="ListParagraph"/>
-        <w:numPr>
-          <w:ilvl w:val="0"/>
-          <w:numId w:val="2"/>
-        </w:numPr>
-      </w:pPr>
-      <w:r>
-        <w:t>Produced unique patient name list confirming 10 repeated patient names across dataset.</w:t>
-      </w:r>
-    </w:p>
-    <w:p>
-      <w:pPr>
-        <w:pStyle w:val="ListParagraph"/>
-        <w:numPr>
-          <w:ilvl w:val="0"/>
-          <w:numId w:val="2"/>
-        </w:numPr>
-      </w:pPr>
-      <w:r>
-        <w:t>Drafted initial problem inventory identifying major data quality issues affecting patient identifiers, diagnosis values, and categorical formatting.</w:t>
-      </w:r>
-    </w:p>
-    <w:p>
-      <w:pPr>
-        <w:pStyle w:val="ListParagraph"/>
-        <w:numPr>
-          <w:ilvl w:val="0"/>
-          <w:numId w:val="2"/>
-        </w:numPr>
-      </w:pPr>
-      <w:r>
-        <w:t>Verified full pipeline execution through run_</w:t>
-      </w:r>
-      <w:proofErr w:type="gramStart"/>
-      <w:r>
-        <w:t>pipeline.R</w:t>
-      </w:r>
-      <w:proofErr w:type="gramEnd"/>
-      <w:r>
-        <w:t xml:space="preserve"> entry-point script.</w:t>
-      </w:r>
-    </w:p>
-    <w:p>
-      <w:pPr>
-        <w:pStyle w:val="ListParagraph"/>
-      </w:pPr>
-    </w:p>
-    <w:p>
-      <w:pPr>
-        <w:pStyle w:val="ListParagraph"/>
-        <w:ind w:left="142"/>
-      </w:pPr>
-      <w:r>
-        <w:t>2. What I plan for next week</w:t>
-      </w:r>
-    </w:p>
-    <w:p>
-      <w:pPr>
-        <w:pStyle w:val="ListParagraph"/>
-      </w:pPr>
-    </w:p>
-    <w:p>
-      <w:pPr>
-        <w:pStyle w:val="ListParagraph"/>
-        <w:numPr>
-          <w:ilvl w:val="0"/>
-          <w:numId w:val="2"/>
-        </w:numPr>
-      </w:pPr>
-      <w:r>
-        <w:t xml:space="preserve">Implement patient identifier cleaning to standardize </w:t>
-      </w:r>
-      <w:proofErr w:type="spellStart"/>
-      <w:r>
-        <w:t>Patient.Name</w:t>
-      </w:r>
-      <w:proofErr w:type="spellEnd"/>
-      <w:r>
-        <w:t xml:space="preserve"> values by trimming whitespace and normalizing case formatting.</w:t>
-      </w:r>
-    </w:p>
-    <w:p>
-      <w:pPr>
-        <w:pStyle w:val="ListParagraph"/>
-        <w:numPr>
-          <w:ilvl w:val="0"/>
-          <w:numId w:val="2"/>
-        </w:numPr>
-      </w:pPr>
-      <w:r>
-        <w:t>Perform admission/discharge (Visit.Date) parsing to convert Visit.Date into standardized Date format and validate date consistency.</w:t>
-      </w:r>
-    </w:p>
-    <w:p>
-      <w:pPr>
-        <w:pStyle w:val="ListParagraph"/>
-        <w:numPr>
-          <w:ilvl w:val="0"/>
-          <w:numId w:val="2"/>
-        </w:numPr>
-      </w:pPr>
-      <w:r>
-        <w:t>Begin free-text diagnosis normalization for Condition variable by standardizing capitalization and mapping equivalent condition labels.</w:t>
-      </w:r>
-    </w:p>
-    <w:p>
-      <w:pPr>
-        <w:pStyle w:val="ListParagraph"/>
-        <w:numPr>
-          <w:ilvl w:val="0"/>
-          <w:numId w:val="2"/>
-        </w:numPr>
-      </w:pPr>
-      <w:r>
-        <w:t>Implement duplicate detection logic to identify potential duplicate patient records using near-duplicate name matching.</w:t>
-      </w:r>
-    </w:p>
-    <w:p>
-      <w:pPr>
-        <w:pStyle w:val="ListParagraph"/>
-        <w:numPr>
-          <w:ilvl w:val="0"/>
-          <w:numId w:val="2"/>
-        </w:numPr>
-      </w:pPr>
-      <w:r>
-        <w:t>Apply categorical case normalization to Gender and Medication variables to ensure consistent category formatting.</w:t>
-      </w:r>
-    </w:p>
-    <w:p>
-      <w:pPr>
-        <w:pStyle w:val="ListParagraph"/>
-        <w:numPr>
-          <w:ilvl w:val="0"/>
-          <w:numId w:val="2"/>
-        </w:numPr>
-      </w:pPr>
-      <w:r>
-        <w:t>Begin constructing the structured data dictionary documenting variable definitions and cleaning actions.</w:t>
-      </w:r>
-    </w:p>
-    <w:p>
-      <w:pPr>
-        <w:pStyle w:val="ListParagraph"/>
-      </w:pPr>
-    </w:p>
-    <w:p>
-      <w:pPr>
-        <w:pStyle w:val="ListParagraph"/>
-        <w:ind w:left="142"/>
-      </w:pPr>
-      <w:r>
-        <w:t>3. Blockers and issues</w:t>
-      </w:r>
-    </w:p>
-    <w:p>
-      <w:pPr>
-        <w:pStyle w:val="ListParagraph"/>
-      </w:pPr>
-    </w:p>
-    <w:p>
-      <w:pPr>
-        <w:pStyle w:val="ListParagraph"/>
-        <w:numPr>
-          <w:ilvl w:val="0"/>
-          <w:numId w:val="2"/>
-        </w:numPr>
-      </w:pPr>
-      <w:r>
-        <w:t>Initial difficulty configuring file paths and ensuring dataset loaded correctly.</w:t>
-      </w:r>
-    </w:p>
-    <w:p>
-      <w:pPr>
-        <w:pStyle w:val="ListParagraph"/>
-        <w:numPr>
-          <w:ilvl w:val="0"/>
-          <w:numId w:val="2"/>
-        </w:numPr>
-      </w:pPr>
-      <w:r>
-        <w:t>Encountered issue where "NaN" values were stored as text instead of true missing values.</w:t>
-      </w:r>
-    </w:p>
-    <w:p>
-      <w:pPr>
-        <w:pStyle w:val="ListParagraph"/>
-        <w:numPr>
-          <w:ilvl w:val="0"/>
-          <w:numId w:val="2"/>
-        </w:numPr>
-      </w:pPr>
-      <w:r>
-        <w:t>Some uncertainty remains regarding best structure for modular cleaning scripts.</w:t>
-      </w:r>
-    </w:p>
-    <w:p>
-      <w:pPr>
-        <w:pStyle w:val="ListParagraph"/>
-        <w:numPr>
-          <w:ilvl w:val="0"/>
-          <w:numId w:val="2"/>
-        </w:numPr>
-      </w:pPr>
-      <w:r>
-        <w:t xml:space="preserve">No critical blockers </w:t>
-      </w:r>
-      <w:proofErr w:type="gramStart"/>
-      <w:r>
-        <w:t>at this time</w:t>
-      </w:r>
-      <w:proofErr w:type="gramEnd"/>
-      <w:r>
-        <w:t>.</w:t>
-      </w:r>
-    </w:p>
-    <w:p>
-      <w:pPr>
-        <w:pStyle w:val="ListParagraph"/>
-      </w:pPr>
-    </w:p>
-    <w:p>
-      <w:pPr>
-        <w:pStyle w:val="ListParagraph"/>
-        <w:ind w:left="284"/>
-      </w:pPr>
-      <w:r>
-        <w:lastRenderedPageBreak/>
-        <w:t>4. Anything I need from the evaluating office</w:t>
-      </w:r>
-    </w:p>
-    <w:p>
-      <w:pPr>
-        <w:pStyle w:val="ListParagraph"/>
-      </w:pPr>
-    </w:p>
-    <w:p>
-      <w:pPr>
-        <w:pStyle w:val="ListParagraph"/>
-        <w:numPr>
-          <w:ilvl w:val="0"/>
-          <w:numId w:val="2"/>
-        </w:numPr>
-      </w:pPr>
-      <w:r>
-        <w:t>Clarification on preferred naming conventions for cleaning script modules.</w:t>
-      </w:r>
-    </w:p>
-    <w:p>
-      <w:pPr>
-        <w:pStyle w:val="ListParagraph"/>
-        <w:numPr>
-          <w:ilvl w:val="0"/>
-          <w:numId w:val="2"/>
-        </w:numPr>
-      </w:pPr>
-      <w:r>
-        <w:t>Confirmation on acceptable thresholds for duplicate detection using string distance.</w:t>
-      </w:r>
     </w:p>
     <w:sectPr>
       <w:pgSz w:w="11906" w:h="16838"/>
-      <w:pgMar w:top="1440" w:right="1440" w:bottom="1440" w:left="1440" w:header="708" w:footer="708" w:gutter="0"/>
+      <w:pgMar w:top="1440" w:right="1440" w:bottom="1440" w:left="993" w:header="708" w:footer="708" w:gutter="0"/>
       <w:cols w:space="708"/>
       <w:docGrid w:linePitch="360"/>
     </w:sectPr>

</xml_diff>

<commit_message>
Update week 1 report with clarification on duplicate detection
</commit_message>
<xml_diff>
--- a/reports/Weekly Report- Week [1].docx
+++ b/reports/Weekly Report- Week [1].docx
@@ -67,7 +67,7 @@
         <w:pStyle w:val="ListParagraph"/>
         <w:numPr>
           <w:ilvl w:val="0"/>
-          <w:numId w:val="2"/>
+          <w:numId w:val="10"/>
         </w:numPr>
         <w:ind w:right="-592"/>
       </w:pPr>
@@ -80,12 +80,18 @@
         <w:pStyle w:val="ListParagraph"/>
         <w:numPr>
           <w:ilvl w:val="0"/>
-          <w:numId w:val="2"/>
+          <w:numId w:val="10"/>
         </w:numPr>
         <w:ind w:right="-592"/>
       </w:pPr>
       <w:r>
-        <w:t>Implemented configuration file (config.R) for centralized path and parameter management.</w:t>
+        <w:t>Implemented configuration file (</w:t>
+      </w:r>
+      <w:r>
+        <w:t>00_</w:t>
+      </w:r>
+      <w:r>
+        <w:t>config.R) for centralized path and parameter management.</w:t>
       </w:r>
     </w:p>
     <w:p>
@@ -93,7 +99,7 @@
         <w:pStyle w:val="ListParagraph"/>
         <w:numPr>
           <w:ilvl w:val="0"/>
-          <w:numId w:val="2"/>
+          <w:numId w:val="10"/>
         </w:numPr>
         <w:ind w:right="-592"/>
       </w:pPr>
@@ -106,7 +112,7 @@
         <w:pStyle w:val="ListParagraph"/>
         <w:numPr>
           <w:ilvl w:val="0"/>
-          <w:numId w:val="2"/>
+          <w:numId w:val="10"/>
         </w:numPr>
         <w:ind w:right="-592"/>
       </w:pPr>
@@ -119,7 +125,7 @@
         <w:pStyle w:val="ListParagraph"/>
         <w:numPr>
           <w:ilvl w:val="0"/>
-          <w:numId w:val="2"/>
+          <w:numId w:val="10"/>
         </w:numPr>
         <w:ind w:right="-592"/>
       </w:pPr>
@@ -132,12 +138,30 @@
         <w:pStyle w:val="ListParagraph"/>
         <w:numPr>
           <w:ilvl w:val="0"/>
-          <w:numId w:val="2"/>
+          <w:numId w:val="10"/>
         </w:numPr>
         <w:ind w:right="-592"/>
       </w:pPr>
       <w:r>
-        <w:t>Generated missingness summary identifying missing values in Blood.Pressure and Cholesterol variables due to text-based "NaN" entries.</w:t>
+        <w:t xml:space="preserve">Generated missingness summary identifying missing values in </w:t>
+      </w:r>
+      <w:r>
+        <w:t xml:space="preserve">Age, </w:t>
+      </w:r>
+      <w:r>
+        <w:t>Blood.Pressure</w:t>
+      </w:r>
+      <w:r>
+        <w:t>,</w:t>
+      </w:r>
+      <w:r>
+        <w:t xml:space="preserve"> Cholesterol</w:t>
+      </w:r>
+      <w:r>
+        <w:t xml:space="preserve">, Email and Phone.Number </w:t>
+      </w:r>
+      <w:r>
+        <w:t>variables due to text-based "NaN" entries.</w:t>
       </w:r>
     </w:p>
     <w:p>
@@ -145,7 +169,7 @@
         <w:pStyle w:val="ListParagraph"/>
         <w:numPr>
           <w:ilvl w:val="0"/>
-          <w:numId w:val="2"/>
+          <w:numId w:val="10"/>
         </w:numPr>
         <w:ind w:right="-592"/>
       </w:pPr>
@@ -158,7 +182,7 @@
         <w:pStyle w:val="ListParagraph"/>
         <w:numPr>
           <w:ilvl w:val="0"/>
-          <w:numId w:val="2"/>
+          <w:numId w:val="10"/>
         </w:numPr>
         <w:ind w:right="-592"/>
       </w:pPr>
@@ -171,7 +195,7 @@
         <w:pStyle w:val="ListParagraph"/>
         <w:numPr>
           <w:ilvl w:val="0"/>
-          <w:numId w:val="2"/>
+          <w:numId w:val="10"/>
         </w:numPr>
         <w:ind w:right="-592"/>
       </w:pPr>
@@ -184,7 +208,7 @@
         <w:pStyle w:val="ListParagraph"/>
         <w:numPr>
           <w:ilvl w:val="0"/>
-          <w:numId w:val="2"/>
+          <w:numId w:val="10"/>
         </w:numPr>
         <w:ind w:right="-592"/>
       </w:pPr>
@@ -215,7 +239,7 @@
         <w:pStyle w:val="ListParagraph"/>
         <w:numPr>
           <w:ilvl w:val="0"/>
-          <w:numId w:val="2"/>
+          <w:numId w:val="11"/>
         </w:numPr>
         <w:ind w:right="-592"/>
       </w:pPr>
@@ -228,7 +252,7 @@
         <w:pStyle w:val="ListParagraph"/>
         <w:numPr>
           <w:ilvl w:val="0"/>
-          <w:numId w:val="2"/>
+          <w:numId w:val="11"/>
         </w:numPr>
         <w:ind w:right="-592"/>
       </w:pPr>
@@ -241,7 +265,7 @@
         <w:pStyle w:val="ListParagraph"/>
         <w:numPr>
           <w:ilvl w:val="0"/>
-          <w:numId w:val="2"/>
+          <w:numId w:val="11"/>
         </w:numPr>
         <w:ind w:right="-592"/>
       </w:pPr>
@@ -254,7 +278,7 @@
         <w:pStyle w:val="ListParagraph"/>
         <w:numPr>
           <w:ilvl w:val="0"/>
-          <w:numId w:val="2"/>
+          <w:numId w:val="11"/>
         </w:numPr>
         <w:ind w:right="-592"/>
       </w:pPr>
@@ -267,7 +291,7 @@
         <w:pStyle w:val="ListParagraph"/>
         <w:numPr>
           <w:ilvl w:val="0"/>
-          <w:numId w:val="2"/>
+          <w:numId w:val="11"/>
         </w:numPr>
         <w:ind w:right="-592"/>
       </w:pPr>
@@ -280,7 +304,7 @@
         <w:pStyle w:val="ListParagraph"/>
         <w:numPr>
           <w:ilvl w:val="0"/>
-          <w:numId w:val="2"/>
+          <w:numId w:val="11"/>
         </w:numPr>
         <w:ind w:right="-592"/>
       </w:pPr>
@@ -308,7 +332,7 @@
         <w:pStyle w:val="ListParagraph"/>
         <w:numPr>
           <w:ilvl w:val="0"/>
-          <w:numId w:val="2"/>
+          <w:numId w:val="12"/>
         </w:numPr>
         <w:ind w:right="-592"/>
       </w:pPr>
@@ -321,7 +345,7 @@
         <w:pStyle w:val="ListParagraph"/>
         <w:numPr>
           <w:ilvl w:val="0"/>
-          <w:numId w:val="2"/>
+          <w:numId w:val="12"/>
         </w:numPr>
         <w:ind w:right="-592"/>
       </w:pPr>
@@ -334,7 +358,7 @@
         <w:pStyle w:val="ListParagraph"/>
         <w:numPr>
           <w:ilvl w:val="0"/>
-          <w:numId w:val="2"/>
+          <w:numId w:val="12"/>
         </w:numPr>
         <w:ind w:right="-592"/>
       </w:pPr>
@@ -347,12 +371,18 @@
         <w:pStyle w:val="ListParagraph"/>
         <w:numPr>
           <w:ilvl w:val="0"/>
-          <w:numId w:val="2"/>
+          <w:numId w:val="12"/>
         </w:numPr>
         <w:ind w:right="-592"/>
       </w:pPr>
       <w:r>
-        <w:t>No critical blockers at this time.</w:t>
+        <w:t xml:space="preserve">No critical blockers </w:t>
+      </w:r>
+      <w:r>
+        <w:t>currently</w:t>
+      </w:r>
+      <w:r>
+        <w:t>.</w:t>
       </w:r>
     </w:p>
     <w:p>
@@ -375,11 +405,23 @@
         <w:pStyle w:val="ListParagraph"/>
         <w:numPr>
           <w:ilvl w:val="0"/>
-          <w:numId w:val="2"/>
+          <w:numId w:val="13"/>
         </w:numPr>
       </w:pPr>
       <w:r>
-        <w:t>Confirmation on acceptable thresholds for duplicate detection using string distance.</w:t>
+        <w:t>Confirmation on acceptable thresholds for duplicate detection using string distance. (</w:t>
+      </w:r>
+      <w:r>
+        <w:t>What</w:t>
+      </w:r>
+      <w:r>
+        <w:t xml:space="preserve"> similarity level should I use when detecting duplicate patient names</w:t>
+      </w:r>
+      <w:r>
+        <w:t>?</w:t>
+      </w:r>
+      <w:r>
+        <w:t xml:space="preserve">) </w:t>
       </w:r>
     </w:p>
     <w:sectPr>
@@ -395,6 +437,119 @@
 <file path=word/numbering.xml><?xml version="1.0" encoding="utf-8"?>
 <w:numbering xmlns:wpc="http://schemas.microsoft.com/office/word/2010/wordprocessingCanvas" xmlns:cx="http://schemas.microsoft.com/office/drawing/2014/chartex" xmlns:cx1="http://schemas.microsoft.com/office/drawing/2015/9/8/chartex" xmlns:cx2="http://schemas.microsoft.com/office/drawing/2015/10/21/chartex" xmlns:cx3="http://schemas.microsoft.com/office/drawing/2016/5/9/chartex" xmlns:cx4="http://schemas.microsoft.com/office/drawing/2016/5/10/chartex" xmlns:cx5="http://schemas.microsoft.com/office/drawing/2016/5/11/chartex" xmlns:cx6="http://schemas.microsoft.com/office/drawing/2016/5/12/chartex" xmlns:cx7="http://schemas.microsoft.com/office/drawing/2016/5/13/chartex" xmlns:cx8="http://schemas.microsoft.com/office/drawing/2016/5/14/chartex" xmlns:mc="http://schemas.openxmlformats.org/markup-compatibility/2006" xmlns:aink="http://schemas.microsoft.com/office/drawing/2016/ink" xmlns:am3d="http://schemas.microsoft.com/office/drawing/2017/model3d" xmlns:o="urn:schemas-microsoft-com:office:office" xmlns:oel="http://schemas.microsoft.com/office/2019/extlst" xmlns:r="http://schemas.openxmlformats.org/officeDocument/2006/relationships" xmlns:m="http://schemas.openxmlformats.org/officeDocument/2006/math" xmlns:v="urn:schemas-microsoft-com:vml" xmlns:wp14="http://schemas.microsoft.com/office/word/2010/wordprocessingDrawing" xmlns:wp="http://schemas.openxmlformats.org/drawingml/2006/wordprocessingDrawing" xmlns:w10="urn:schemas-microsoft-com:office:word" xmlns:w="http://schemas.openxmlformats.org/wordprocessingml/2006/main" xmlns:w14="http://schemas.microsoft.com/office/word/2010/wordml" xmlns:w15="http://schemas.microsoft.com/office/word/2012/wordml" xmlns:w16cex="http://schemas.microsoft.com/office/word/2018/wordml/cex" xmlns:w16cid="http://schemas.microsoft.com/office/word/2016/wordml/cid" xmlns:w16="http://schemas.microsoft.com/office/word/2018/wordml" xmlns:w16du="http://schemas.microsoft.com/office/word/2023/wordml/word16du" xmlns:w16sdtdh="http://schemas.microsoft.com/office/word/2020/wordml/sdtdatahash" xmlns:w16sdtfl="http://schemas.microsoft.com/office/word/2024/wordml/sdtformatlock" xmlns:w16se="http://schemas.microsoft.com/office/word/2015/wordml/symex" xmlns:wpg="http://schemas.microsoft.com/office/word/2010/wordprocessingGroup" xmlns:wpi="http://schemas.microsoft.com/office/word/2010/wordprocessingInk" xmlns:wne="http://schemas.microsoft.com/office/word/2006/wordml" xmlns:wps="http://schemas.microsoft.com/office/word/2010/wordprocessingShape" mc:Ignorable="w14 w15 w16se w16cid w16 w16cex w16sdtdh w16sdtfl w16du wp14">
   <w:abstractNum w:abstractNumId="0" w15:restartNumberingAfterBreak="0">
+    <w:nsid w:val="18257379"/>
+    <w:multiLevelType w:val="hybridMultilevel"/>
+    <w:tmpl w:val="5A861E3A"/>
+    <w:lvl w:ilvl="0" w:tplc="20000001">
+      <w:start w:val="1"/>
+      <w:numFmt w:val="bullet"/>
+      <w:lvlText w:val=""/>
+      <w:lvlJc w:val="left"/>
+      <w:pPr>
+        <w:ind w:left="1080" w:hanging="360"/>
+      </w:pPr>
+      <w:rPr>
+        <w:rFonts w:ascii="Symbol" w:hAnsi="Symbol" w:hint="default"/>
+      </w:rPr>
+    </w:lvl>
+    <w:lvl w:ilvl="1" w:tplc="20000003" w:tentative="1">
+      <w:start w:val="1"/>
+      <w:numFmt w:val="bullet"/>
+      <w:lvlText w:val="o"/>
+      <w:lvlJc w:val="left"/>
+      <w:pPr>
+        <w:ind w:left="1800" w:hanging="360"/>
+      </w:pPr>
+      <w:rPr>
+        <w:rFonts w:ascii="Courier New" w:hAnsi="Courier New" w:cs="Courier New" w:hint="default"/>
+      </w:rPr>
+    </w:lvl>
+    <w:lvl w:ilvl="2" w:tplc="20000005" w:tentative="1">
+      <w:start w:val="1"/>
+      <w:numFmt w:val="bullet"/>
+      <w:lvlText w:val=""/>
+      <w:lvlJc w:val="left"/>
+      <w:pPr>
+        <w:ind w:left="2520" w:hanging="360"/>
+      </w:pPr>
+      <w:rPr>
+        <w:rFonts w:ascii="Wingdings" w:hAnsi="Wingdings" w:hint="default"/>
+      </w:rPr>
+    </w:lvl>
+    <w:lvl w:ilvl="3" w:tplc="20000001" w:tentative="1">
+      <w:start w:val="1"/>
+      <w:numFmt w:val="bullet"/>
+      <w:lvlText w:val=""/>
+      <w:lvlJc w:val="left"/>
+      <w:pPr>
+        <w:ind w:left="3240" w:hanging="360"/>
+      </w:pPr>
+      <w:rPr>
+        <w:rFonts w:ascii="Symbol" w:hAnsi="Symbol" w:hint="default"/>
+      </w:rPr>
+    </w:lvl>
+    <w:lvl w:ilvl="4" w:tplc="20000003" w:tentative="1">
+      <w:start w:val="1"/>
+      <w:numFmt w:val="bullet"/>
+      <w:lvlText w:val="o"/>
+      <w:lvlJc w:val="left"/>
+      <w:pPr>
+        <w:ind w:left="3960" w:hanging="360"/>
+      </w:pPr>
+      <w:rPr>
+        <w:rFonts w:ascii="Courier New" w:hAnsi="Courier New" w:cs="Courier New" w:hint="default"/>
+      </w:rPr>
+    </w:lvl>
+    <w:lvl w:ilvl="5" w:tplc="20000005" w:tentative="1">
+      <w:start w:val="1"/>
+      <w:numFmt w:val="bullet"/>
+      <w:lvlText w:val=""/>
+      <w:lvlJc w:val="left"/>
+      <w:pPr>
+        <w:ind w:left="4680" w:hanging="360"/>
+      </w:pPr>
+      <w:rPr>
+        <w:rFonts w:ascii="Wingdings" w:hAnsi="Wingdings" w:hint="default"/>
+      </w:rPr>
+    </w:lvl>
+    <w:lvl w:ilvl="6" w:tplc="20000001" w:tentative="1">
+      <w:start w:val="1"/>
+      <w:numFmt w:val="bullet"/>
+      <w:lvlText w:val=""/>
+      <w:lvlJc w:val="left"/>
+      <w:pPr>
+        <w:ind w:left="5400" w:hanging="360"/>
+      </w:pPr>
+      <w:rPr>
+        <w:rFonts w:ascii="Symbol" w:hAnsi="Symbol" w:hint="default"/>
+      </w:rPr>
+    </w:lvl>
+    <w:lvl w:ilvl="7" w:tplc="20000003" w:tentative="1">
+      <w:start w:val="1"/>
+      <w:numFmt w:val="bullet"/>
+      <w:lvlText w:val="o"/>
+      <w:lvlJc w:val="left"/>
+      <w:pPr>
+        <w:ind w:left="6120" w:hanging="360"/>
+      </w:pPr>
+      <w:rPr>
+        <w:rFonts w:ascii="Courier New" w:hAnsi="Courier New" w:cs="Courier New" w:hint="default"/>
+      </w:rPr>
+    </w:lvl>
+    <w:lvl w:ilvl="8" w:tplc="20000005" w:tentative="1">
+      <w:start w:val="1"/>
+      <w:numFmt w:val="bullet"/>
+      <w:lvlText w:val=""/>
+      <w:lvlJc w:val="left"/>
+      <w:pPr>
+        <w:ind w:left="6840" w:hanging="360"/>
+      </w:pPr>
+      <w:rPr>
+        <w:rFonts w:ascii="Wingdings" w:hAnsi="Wingdings" w:hint="default"/>
+      </w:rPr>
+    </w:lvl>
+  </w:abstractNum>
+  <w:abstractNum w:abstractNumId="1" w15:restartNumberingAfterBreak="0">
     <w:nsid w:val="2BC90525"/>
     <w:multiLevelType w:val="hybridMultilevel"/>
     <w:tmpl w:val="3E522656"/>
@@ -507,7 +662,7 @@
       </w:rPr>
     </w:lvl>
   </w:abstractNum>
-  <w:abstractNum w:abstractNumId="1" w15:restartNumberingAfterBreak="0">
+  <w:abstractNum w:abstractNumId="2" w15:restartNumberingAfterBreak="0">
     <w:nsid w:val="366F7D21"/>
     <w:multiLevelType w:val="hybridMultilevel"/>
     <w:tmpl w:val="CC08C38C"/>
@@ -620,7 +775,7 @@
       </w:rPr>
     </w:lvl>
   </w:abstractNum>
-  <w:abstractNum w:abstractNumId="2" w15:restartNumberingAfterBreak="0">
+  <w:abstractNum w:abstractNumId="3" w15:restartNumberingAfterBreak="0">
     <w:nsid w:val="39CF7D11"/>
     <w:multiLevelType w:val="hybridMultilevel"/>
     <w:tmpl w:val="808CF488"/>
@@ -733,7 +888,346 @@
       </w:rPr>
     </w:lvl>
   </w:abstractNum>
-  <w:abstractNum w:abstractNumId="3" w15:restartNumberingAfterBreak="0">
+  <w:abstractNum w:abstractNumId="4" w15:restartNumberingAfterBreak="0">
+    <w:nsid w:val="426C658E"/>
+    <w:multiLevelType w:val="hybridMultilevel"/>
+    <w:tmpl w:val="C658AB0A"/>
+    <w:lvl w:ilvl="0" w:tplc="20000001">
+      <w:start w:val="1"/>
+      <w:numFmt w:val="bullet"/>
+      <w:lvlText w:val=""/>
+      <w:lvlJc w:val="left"/>
+      <w:pPr>
+        <w:ind w:left="720" w:hanging="360"/>
+      </w:pPr>
+      <w:rPr>
+        <w:rFonts w:ascii="Symbol" w:hAnsi="Symbol" w:hint="default"/>
+      </w:rPr>
+    </w:lvl>
+    <w:lvl w:ilvl="1" w:tplc="FFFFFFFF" w:tentative="1">
+      <w:start w:val="1"/>
+      <w:numFmt w:val="bullet"/>
+      <w:lvlText w:val="o"/>
+      <w:lvlJc w:val="left"/>
+      <w:pPr>
+        <w:ind w:left="1440" w:hanging="360"/>
+      </w:pPr>
+      <w:rPr>
+        <w:rFonts w:ascii="Courier New" w:hAnsi="Courier New" w:cs="Courier New" w:hint="default"/>
+      </w:rPr>
+    </w:lvl>
+    <w:lvl w:ilvl="2" w:tplc="FFFFFFFF" w:tentative="1">
+      <w:start w:val="1"/>
+      <w:numFmt w:val="bullet"/>
+      <w:lvlText w:val=""/>
+      <w:lvlJc w:val="left"/>
+      <w:pPr>
+        <w:ind w:left="2160" w:hanging="360"/>
+      </w:pPr>
+      <w:rPr>
+        <w:rFonts w:ascii="Wingdings" w:hAnsi="Wingdings" w:hint="default"/>
+      </w:rPr>
+    </w:lvl>
+    <w:lvl w:ilvl="3" w:tplc="FFFFFFFF" w:tentative="1">
+      <w:start w:val="1"/>
+      <w:numFmt w:val="bullet"/>
+      <w:lvlText w:val=""/>
+      <w:lvlJc w:val="left"/>
+      <w:pPr>
+        <w:ind w:left="2880" w:hanging="360"/>
+      </w:pPr>
+      <w:rPr>
+        <w:rFonts w:ascii="Symbol" w:hAnsi="Symbol" w:hint="default"/>
+      </w:rPr>
+    </w:lvl>
+    <w:lvl w:ilvl="4" w:tplc="FFFFFFFF" w:tentative="1">
+      <w:start w:val="1"/>
+      <w:numFmt w:val="bullet"/>
+      <w:lvlText w:val="o"/>
+      <w:lvlJc w:val="left"/>
+      <w:pPr>
+        <w:ind w:left="3600" w:hanging="360"/>
+      </w:pPr>
+      <w:rPr>
+        <w:rFonts w:ascii="Courier New" w:hAnsi="Courier New" w:cs="Courier New" w:hint="default"/>
+      </w:rPr>
+    </w:lvl>
+    <w:lvl w:ilvl="5" w:tplc="FFFFFFFF" w:tentative="1">
+      <w:start w:val="1"/>
+      <w:numFmt w:val="bullet"/>
+      <w:lvlText w:val=""/>
+      <w:lvlJc w:val="left"/>
+      <w:pPr>
+        <w:ind w:left="4320" w:hanging="360"/>
+      </w:pPr>
+      <w:rPr>
+        <w:rFonts w:ascii="Wingdings" w:hAnsi="Wingdings" w:hint="default"/>
+      </w:rPr>
+    </w:lvl>
+    <w:lvl w:ilvl="6" w:tplc="FFFFFFFF" w:tentative="1">
+      <w:start w:val="1"/>
+      <w:numFmt w:val="bullet"/>
+      <w:lvlText w:val=""/>
+      <w:lvlJc w:val="left"/>
+      <w:pPr>
+        <w:ind w:left="5040" w:hanging="360"/>
+      </w:pPr>
+      <w:rPr>
+        <w:rFonts w:ascii="Symbol" w:hAnsi="Symbol" w:hint="default"/>
+      </w:rPr>
+    </w:lvl>
+    <w:lvl w:ilvl="7" w:tplc="FFFFFFFF" w:tentative="1">
+      <w:start w:val="1"/>
+      <w:numFmt w:val="bullet"/>
+      <w:lvlText w:val="o"/>
+      <w:lvlJc w:val="left"/>
+      <w:pPr>
+        <w:ind w:left="5760" w:hanging="360"/>
+      </w:pPr>
+      <w:rPr>
+        <w:rFonts w:ascii="Courier New" w:hAnsi="Courier New" w:cs="Courier New" w:hint="default"/>
+      </w:rPr>
+    </w:lvl>
+    <w:lvl w:ilvl="8" w:tplc="FFFFFFFF" w:tentative="1">
+      <w:start w:val="1"/>
+      <w:numFmt w:val="bullet"/>
+      <w:lvlText w:val=""/>
+      <w:lvlJc w:val="left"/>
+      <w:pPr>
+        <w:ind w:left="6480" w:hanging="360"/>
+      </w:pPr>
+      <w:rPr>
+        <w:rFonts w:ascii="Wingdings" w:hAnsi="Wingdings" w:hint="default"/>
+      </w:rPr>
+    </w:lvl>
+  </w:abstractNum>
+  <w:abstractNum w:abstractNumId="5" w15:restartNumberingAfterBreak="0">
+    <w:nsid w:val="4D201B61"/>
+    <w:multiLevelType w:val="hybridMultilevel"/>
+    <w:tmpl w:val="FA948674"/>
+    <w:lvl w:ilvl="0" w:tplc="20000001">
+      <w:start w:val="1"/>
+      <w:numFmt w:val="bullet"/>
+      <w:lvlText w:val=""/>
+      <w:lvlJc w:val="left"/>
+      <w:pPr>
+        <w:ind w:left="1080" w:hanging="360"/>
+      </w:pPr>
+      <w:rPr>
+        <w:rFonts w:ascii="Symbol" w:hAnsi="Symbol" w:hint="default"/>
+      </w:rPr>
+    </w:lvl>
+    <w:lvl w:ilvl="1" w:tplc="20000003" w:tentative="1">
+      <w:start w:val="1"/>
+      <w:numFmt w:val="bullet"/>
+      <w:lvlText w:val="o"/>
+      <w:lvlJc w:val="left"/>
+      <w:pPr>
+        <w:ind w:left="1800" w:hanging="360"/>
+      </w:pPr>
+      <w:rPr>
+        <w:rFonts w:ascii="Courier New" w:hAnsi="Courier New" w:cs="Courier New" w:hint="default"/>
+      </w:rPr>
+    </w:lvl>
+    <w:lvl w:ilvl="2" w:tplc="20000005" w:tentative="1">
+      <w:start w:val="1"/>
+      <w:numFmt w:val="bullet"/>
+      <w:lvlText w:val=""/>
+      <w:lvlJc w:val="left"/>
+      <w:pPr>
+        <w:ind w:left="2520" w:hanging="360"/>
+      </w:pPr>
+      <w:rPr>
+        <w:rFonts w:ascii="Wingdings" w:hAnsi="Wingdings" w:hint="default"/>
+      </w:rPr>
+    </w:lvl>
+    <w:lvl w:ilvl="3" w:tplc="20000001" w:tentative="1">
+      <w:start w:val="1"/>
+      <w:numFmt w:val="bullet"/>
+      <w:lvlText w:val=""/>
+      <w:lvlJc w:val="left"/>
+      <w:pPr>
+        <w:ind w:left="3240" w:hanging="360"/>
+      </w:pPr>
+      <w:rPr>
+        <w:rFonts w:ascii="Symbol" w:hAnsi="Symbol" w:hint="default"/>
+      </w:rPr>
+    </w:lvl>
+    <w:lvl w:ilvl="4" w:tplc="20000003" w:tentative="1">
+      <w:start w:val="1"/>
+      <w:numFmt w:val="bullet"/>
+      <w:lvlText w:val="o"/>
+      <w:lvlJc w:val="left"/>
+      <w:pPr>
+        <w:ind w:left="3960" w:hanging="360"/>
+      </w:pPr>
+      <w:rPr>
+        <w:rFonts w:ascii="Courier New" w:hAnsi="Courier New" w:cs="Courier New" w:hint="default"/>
+      </w:rPr>
+    </w:lvl>
+    <w:lvl w:ilvl="5" w:tplc="20000005" w:tentative="1">
+      <w:start w:val="1"/>
+      <w:numFmt w:val="bullet"/>
+      <w:lvlText w:val=""/>
+      <w:lvlJc w:val="left"/>
+      <w:pPr>
+        <w:ind w:left="4680" w:hanging="360"/>
+      </w:pPr>
+      <w:rPr>
+        <w:rFonts w:ascii="Wingdings" w:hAnsi="Wingdings" w:hint="default"/>
+      </w:rPr>
+    </w:lvl>
+    <w:lvl w:ilvl="6" w:tplc="20000001" w:tentative="1">
+      <w:start w:val="1"/>
+      <w:numFmt w:val="bullet"/>
+      <w:lvlText w:val=""/>
+      <w:lvlJc w:val="left"/>
+      <w:pPr>
+        <w:ind w:left="5400" w:hanging="360"/>
+      </w:pPr>
+      <w:rPr>
+        <w:rFonts w:ascii="Symbol" w:hAnsi="Symbol" w:hint="default"/>
+      </w:rPr>
+    </w:lvl>
+    <w:lvl w:ilvl="7" w:tplc="20000003" w:tentative="1">
+      <w:start w:val="1"/>
+      <w:numFmt w:val="bullet"/>
+      <w:lvlText w:val="o"/>
+      <w:lvlJc w:val="left"/>
+      <w:pPr>
+        <w:ind w:left="6120" w:hanging="360"/>
+      </w:pPr>
+      <w:rPr>
+        <w:rFonts w:ascii="Courier New" w:hAnsi="Courier New" w:cs="Courier New" w:hint="default"/>
+      </w:rPr>
+    </w:lvl>
+    <w:lvl w:ilvl="8" w:tplc="20000005" w:tentative="1">
+      <w:start w:val="1"/>
+      <w:numFmt w:val="bullet"/>
+      <w:lvlText w:val=""/>
+      <w:lvlJc w:val="left"/>
+      <w:pPr>
+        <w:ind w:left="6840" w:hanging="360"/>
+      </w:pPr>
+      <w:rPr>
+        <w:rFonts w:ascii="Wingdings" w:hAnsi="Wingdings" w:hint="default"/>
+      </w:rPr>
+    </w:lvl>
+  </w:abstractNum>
+  <w:abstractNum w:abstractNumId="6" w15:restartNumberingAfterBreak="0">
+    <w:nsid w:val="4DCE25F0"/>
+    <w:multiLevelType w:val="hybridMultilevel"/>
+    <w:tmpl w:val="1D825BD8"/>
+    <w:lvl w:ilvl="0" w:tplc="20000001">
+      <w:start w:val="1"/>
+      <w:numFmt w:val="bullet"/>
+      <w:lvlText w:val=""/>
+      <w:lvlJc w:val="left"/>
+      <w:pPr>
+        <w:ind w:left="1080" w:hanging="360"/>
+      </w:pPr>
+      <w:rPr>
+        <w:rFonts w:ascii="Symbol" w:hAnsi="Symbol" w:hint="default"/>
+      </w:rPr>
+    </w:lvl>
+    <w:lvl w:ilvl="1" w:tplc="20000003" w:tentative="1">
+      <w:start w:val="1"/>
+      <w:numFmt w:val="bullet"/>
+      <w:lvlText w:val="o"/>
+      <w:lvlJc w:val="left"/>
+      <w:pPr>
+        <w:ind w:left="1800" w:hanging="360"/>
+      </w:pPr>
+      <w:rPr>
+        <w:rFonts w:ascii="Courier New" w:hAnsi="Courier New" w:cs="Courier New" w:hint="default"/>
+      </w:rPr>
+    </w:lvl>
+    <w:lvl w:ilvl="2" w:tplc="20000005" w:tentative="1">
+      <w:start w:val="1"/>
+      <w:numFmt w:val="bullet"/>
+      <w:lvlText w:val=""/>
+      <w:lvlJc w:val="left"/>
+      <w:pPr>
+        <w:ind w:left="2520" w:hanging="360"/>
+      </w:pPr>
+      <w:rPr>
+        <w:rFonts w:ascii="Wingdings" w:hAnsi="Wingdings" w:hint="default"/>
+      </w:rPr>
+    </w:lvl>
+    <w:lvl w:ilvl="3" w:tplc="20000001" w:tentative="1">
+      <w:start w:val="1"/>
+      <w:numFmt w:val="bullet"/>
+      <w:lvlText w:val=""/>
+      <w:lvlJc w:val="left"/>
+      <w:pPr>
+        <w:ind w:left="3240" w:hanging="360"/>
+      </w:pPr>
+      <w:rPr>
+        <w:rFonts w:ascii="Symbol" w:hAnsi="Symbol" w:hint="default"/>
+      </w:rPr>
+    </w:lvl>
+    <w:lvl w:ilvl="4" w:tplc="20000003" w:tentative="1">
+      <w:start w:val="1"/>
+      <w:numFmt w:val="bullet"/>
+      <w:lvlText w:val="o"/>
+      <w:lvlJc w:val="left"/>
+      <w:pPr>
+        <w:ind w:left="3960" w:hanging="360"/>
+      </w:pPr>
+      <w:rPr>
+        <w:rFonts w:ascii="Courier New" w:hAnsi="Courier New" w:cs="Courier New" w:hint="default"/>
+      </w:rPr>
+    </w:lvl>
+    <w:lvl w:ilvl="5" w:tplc="20000005" w:tentative="1">
+      <w:start w:val="1"/>
+      <w:numFmt w:val="bullet"/>
+      <w:lvlText w:val=""/>
+      <w:lvlJc w:val="left"/>
+      <w:pPr>
+        <w:ind w:left="4680" w:hanging="360"/>
+      </w:pPr>
+      <w:rPr>
+        <w:rFonts w:ascii="Wingdings" w:hAnsi="Wingdings" w:hint="default"/>
+      </w:rPr>
+    </w:lvl>
+    <w:lvl w:ilvl="6" w:tplc="20000001" w:tentative="1">
+      <w:start w:val="1"/>
+      <w:numFmt w:val="bullet"/>
+      <w:lvlText w:val=""/>
+      <w:lvlJc w:val="left"/>
+      <w:pPr>
+        <w:ind w:left="5400" w:hanging="360"/>
+      </w:pPr>
+      <w:rPr>
+        <w:rFonts w:ascii="Symbol" w:hAnsi="Symbol" w:hint="default"/>
+      </w:rPr>
+    </w:lvl>
+    <w:lvl w:ilvl="7" w:tplc="20000003" w:tentative="1">
+      <w:start w:val="1"/>
+      <w:numFmt w:val="bullet"/>
+      <w:lvlText w:val="o"/>
+      <w:lvlJc w:val="left"/>
+      <w:pPr>
+        <w:ind w:left="6120" w:hanging="360"/>
+      </w:pPr>
+      <w:rPr>
+        <w:rFonts w:ascii="Courier New" w:hAnsi="Courier New" w:cs="Courier New" w:hint="default"/>
+      </w:rPr>
+    </w:lvl>
+    <w:lvl w:ilvl="8" w:tplc="20000005" w:tentative="1">
+      <w:start w:val="1"/>
+      <w:numFmt w:val="bullet"/>
+      <w:lvlText w:val=""/>
+      <w:lvlJc w:val="left"/>
+      <w:pPr>
+        <w:ind w:left="6840" w:hanging="360"/>
+      </w:pPr>
+      <w:rPr>
+        <w:rFonts w:ascii="Wingdings" w:hAnsi="Wingdings" w:hint="default"/>
+      </w:rPr>
+    </w:lvl>
+  </w:abstractNum>
+  <w:abstractNum w:abstractNumId="7" w15:restartNumberingAfterBreak="0">
     <w:nsid w:val="5CC94AB6"/>
     <w:multiLevelType w:val="hybridMultilevel"/>
     <w:tmpl w:val="D3341EB6"/>
@@ -846,7 +1340,7 @@
       </w:rPr>
     </w:lvl>
   </w:abstractNum>
-  <w:abstractNum w:abstractNumId="4" w15:restartNumberingAfterBreak="0">
+  <w:abstractNum w:abstractNumId="8" w15:restartNumberingAfterBreak="0">
     <w:nsid w:val="61222E65"/>
     <w:multiLevelType w:val="hybridMultilevel"/>
     <w:tmpl w:val="30162690"/>
@@ -959,7 +1453,7 @@
       </w:rPr>
     </w:lvl>
   </w:abstractNum>
-  <w:abstractNum w:abstractNumId="5" w15:restartNumberingAfterBreak="0">
+  <w:abstractNum w:abstractNumId="9" w15:restartNumberingAfterBreak="0">
     <w:nsid w:val="69A23506"/>
     <w:multiLevelType w:val="hybridMultilevel"/>
     <w:tmpl w:val="E312C20C"/>
@@ -1072,7 +1566,7 @@
       </w:rPr>
     </w:lvl>
   </w:abstractNum>
-  <w:abstractNum w:abstractNumId="6" w15:restartNumberingAfterBreak="0">
+  <w:abstractNum w:abstractNumId="10" w15:restartNumberingAfterBreak="0">
     <w:nsid w:val="74D27F5B"/>
     <w:multiLevelType w:val="hybridMultilevel"/>
     <w:tmpl w:val="303A65A8"/>
@@ -1185,7 +1679,7 @@
       </w:rPr>
     </w:lvl>
   </w:abstractNum>
-  <w:abstractNum w:abstractNumId="7" w15:restartNumberingAfterBreak="0">
+  <w:abstractNum w:abstractNumId="11" w15:restartNumberingAfterBreak="0">
     <w:nsid w:val="75F45069"/>
     <w:multiLevelType w:val="hybridMultilevel"/>
     <w:tmpl w:val="03867822"/>
@@ -1298,7 +1792,7 @@
       </w:rPr>
     </w:lvl>
   </w:abstractNum>
-  <w:abstractNum w:abstractNumId="8" w15:restartNumberingAfterBreak="0">
+  <w:abstractNum w:abstractNumId="12" w15:restartNumberingAfterBreak="0">
     <w:nsid w:val="76AD0C06"/>
     <w:multiLevelType w:val="hybridMultilevel"/>
     <w:tmpl w:val="C3A412C8"/>
@@ -1412,31 +1906,43 @@
     </w:lvl>
   </w:abstractNum>
   <w:num w:numId="1" w16cid:durableId="898398254">
+    <w:abstractNumId w:val="7"/>
+  </w:num>
+  <w:num w:numId="2" w16cid:durableId="551961207">
+    <w:abstractNumId w:val="2"/>
+  </w:num>
+  <w:num w:numId="3" w16cid:durableId="1695690237">
+    <w:abstractNumId w:val="11"/>
+  </w:num>
+  <w:num w:numId="4" w16cid:durableId="67461665">
+    <w:abstractNumId w:val="8"/>
+  </w:num>
+  <w:num w:numId="5" w16cid:durableId="889223183">
+    <w:abstractNumId w:val="1"/>
+  </w:num>
+  <w:num w:numId="6" w16cid:durableId="280690887">
+    <w:abstractNumId w:val="12"/>
+  </w:num>
+  <w:num w:numId="7" w16cid:durableId="800152651">
+    <w:abstractNumId w:val="10"/>
+  </w:num>
+  <w:num w:numId="8" w16cid:durableId="958727766">
     <w:abstractNumId w:val="3"/>
   </w:num>
-  <w:num w:numId="2" w16cid:durableId="551961207">
-    <w:abstractNumId w:val="1"/>
+  <w:num w:numId="9" w16cid:durableId="208034257">
+    <w:abstractNumId w:val="9"/>
   </w:num>
-  <w:num w:numId="3" w16cid:durableId="1695690237">
-    <w:abstractNumId w:val="7"/>
-  </w:num>
-  <w:num w:numId="4" w16cid:durableId="67461665">
+  <w:num w:numId="10" w16cid:durableId="1002586905">
     <w:abstractNumId w:val="4"/>
   </w:num>
-  <w:num w:numId="5" w16cid:durableId="889223183">
-    <w:abstractNumId w:val="0"/>
-  </w:num>
-  <w:num w:numId="6" w16cid:durableId="280690887">
-    <w:abstractNumId w:val="8"/>
-  </w:num>
-  <w:num w:numId="7" w16cid:durableId="800152651">
+  <w:num w:numId="11" w16cid:durableId="320357595">
     <w:abstractNumId w:val="6"/>
   </w:num>
-  <w:num w:numId="8" w16cid:durableId="958727766">
-    <w:abstractNumId w:val="2"/>
+  <w:num w:numId="12" w16cid:durableId="1110971054">
+    <w:abstractNumId w:val="5"/>
   </w:num>
-  <w:num w:numId="9" w16cid:durableId="208034257">
-    <w:abstractNumId w:val="5"/>
+  <w:num w:numId="13" w16cid:durableId="1723402353">
+    <w:abstractNumId w:val="0"/>
   </w:num>
 </w:numbering>
 </file>

</xml_diff>